<commit_message>
Refúgio dos 4 Elementos: fecha logo final e aplicações fictícias (post, anúncio, banner)
</commit_message>
<xml_diff>
--- a/refugio-dos-4-elementos/manual-de-marca.docx
+++ b/refugio-dos-4-elementos/manual-de-marca.docx
@@ -378,7 +378,7 @@
         <w:pStyle w:val="Heading1"/>
       </w:pPr>
       <w:r>
-        <w:t>4. Logo</w:t>
+        <w:t>4. Logo — FECHADO</w:t>
       </w:r>
     </w:p>
     <w:p>
@@ -386,10 +386,10 @@
         <w:rPr>
           <w:b/>
         </w:rPr>
-        <w:t>Conceito:</w:t>
+        <w:t>Conceito (versão final aprovada):</w:t>
       </w:r>
       <w:r>
-        <w:t xml:space="preserve"> Um círculo central — representando a essência humana, "voltar pra casa: pra dentro de si mesmo" — ao redor do qual se distribuem 4 ícones simples e minimalistas representando os elementos: uma gota (Água), uma chama (Fogo), uma pluma ou espiral de vento (Ar) e uma folha ou pequena montanha (Terra). O nome "Refúgio dos 4 Elementos" usa a tipografia de título da marca (ver seção 6).</w:t>
+        <w:t xml:space="preserve"> Um anel fino e delicado (não um traço grosso) com o interior vazio — sem ponto central, sem linhas internas dividindo o círculo. Sobre a própria linha do anel, 4 ícones simples sentados como marcadores: chama (Fogo, terracota) no topo, gota (Água, azul acinzentado) à direita, folha com uma linha central (Terra, verde sálvia) na base, e vento — duas linhas curvas fluindo terminando em espiral (Ar, marrom) à esquerda. O nome "Refúgio dos 4 Elementos" usa Cormorant Garamond (ver seção 6). Logo desenvolvido com a usuária via iteração de prompt em IA generativa (Recraft Red Panda) e finalizado/montado no Canva.</w:t>
       </w:r>
     </w:p>
     <w:p>
@@ -397,7 +397,10 @@
         <w:rPr>
           <w:b/>
         </w:rPr>
-        <w:t>Variações necessárias:</w:t>
+        <w:t>Arquivos finais</w:t>
+      </w:r>
+      <w:r>
+        <w:t xml:space="preserve"> (salvos em `refugio-dos-4-elementos/LOGO_R_4_E_com_variações/` e `LOGO_R_4_E_com_variações_com_fundo/`):</w:t>
       </w:r>
     </w:p>
     <w:p>
@@ -405,7 +408,7 @@
         <w:pStyle w:val="ListBullet"/>
       </w:pPr>
       <w:r>
-        <w:t>Logo completo (símbolo + nome) — uso principal em site, capa de redes sociais, materiais impressos</w:t>
+        <w:t>Símbolo isolado, colorido, fundo transparente e fundo creme — uso em foto de perfil do Instagram/WhatsApp Business, favicon</w:t>
       </w:r>
     </w:p>
     <w:p>
@@ -413,7 +416,7 @@
         <w:pStyle w:val="ListBullet"/>
       </w:pPr>
       <w:r>
-        <w:t>Símbolo isolado (só o círculo + 4 ícones) — uso em foto de perfil do Instagram/WhatsApp Business, favicon</w:t>
+        <w:t>Logo completo vertical (símbolo + nome), colorido — uso principal em site, materiais impressos</w:t>
       </w:r>
     </w:p>
     <w:p>
@@ -421,7 +424,7 @@
         <w:pStyle w:val="ListBullet"/>
       </w:pPr>
       <w:r>
-        <w:t>Versão horizontal (símbolo ao lado do nome) — uso em banners e cabeçalhos largos</w:t>
+        <w:t>Logo horizontal (símbolo + nome lado a lado), branco sobre fundo lilás — uso em banners e capas largas</w:t>
       </w:r>
     </w:p>
     <w:p>
@@ -429,7 +432,18 @@
         <w:pStyle w:val="ListBullet"/>
       </w:pPr>
       <w:r>
-        <w:t>Versão monocromática preto e branca — uso sobre fotos ou fundos onde a versão colorida perca contraste</w:t>
+        <w:t>Versão monocromática (marrom `#3B2E2A` e branca) do símbolo e do logo completo — uso sobre fotos ou fundos onde a versão colorida perca contraste</w:t>
+      </w:r>
+    </w:p>
+    <w:p>
+      <w:r>
+        <w:rPr>
+          <w:b/>
+        </w:rPr>
+        <w:t>Aplicações fictícias de exemplo</w:t>
+      </w:r>
+      <w:r>
+        <w:t xml:space="preserve"> geradas para validar legibilidade em contexto real: ver `aplicacoes-ficticias/` (post de Instagram, anúncio Stories/Reels, banner de Imersão na Cachoeira).</w:t>
       </w:r>
     </w:p>
     <w:p>
@@ -440,7 +454,7 @@
         <w:t>Área de respiro mínima e tamanho mínimo:</w:t>
       </w:r>
       <w:r>
-        <w:t xml:space="preserve"> Manter ao redor do logo um espaço livre equivalente à altura do círculo central — não posicionar texto ou outros elementos dentro dessa margem. Em uso digital, não reduzir o logo completo a menos de 120px de largura, para não perder a legibilidade dos 4 ícones.</w:t>
+        <w:t xml:space="preserve"> Manter ao redor do logo um espaço livre equivalente à altura do símbolo. Em uso digital, não reduzir o logo completo a menos de 120px de largura, para não perder a legibilidade dos 4 ícones — o anel é fino por design, então tamanhos muito pequenos tendem a "sumir" o traço antes dos ícones.</w:t>
       </w:r>
     </w:p>
     <w:p>

</xml_diff>

<commit_message>
Refúgio dos 4 Elementos: anexa imagens do logo/aplicações ao manual de marca + cria apresentação de slides pra entrega ao cliente
</commit_message>
<xml_diff>
--- a/refugio-dos-4-elementos/manual-de-marca.docx
+++ b/refugio-dos-4-elementos/manual-de-marca.docx
@@ -1095,6 +1095,385 @@
         <w:t xml:space="preserve"> Fundo dividido em faixas com as 4 cores de apoio (Terracota, Azul Acinzentado, Creme Areia, Verde Sálvia), simbolizando os 4 elementos, com o símbolo do logo centralizado e o nome "Refúgio dos 4 Elementos" em Cormorant Garamond sobre uma faixa central em Lilás Refúgio.</w:t>
       </w:r>
     </w:p>
+    <w:p>
+      <w:pPr>
+        <w:pStyle w:val="Heading1"/>
+      </w:pPr>
+      <w:r>
+        <w:t>8. Anexo Visual — Logo, Variações e Aplicações</w:t>
+      </w:r>
+    </w:p>
+    <w:p>
+      <w:pPr>
+        <w:pStyle w:val="Heading2"/>
+      </w:pPr>
+      <w:r>
+        <w:t>Logo — símbolo isolado (colorido)</w:t>
+      </w:r>
+    </w:p>
+    <w:p>
+      <w:r>
+        <w:drawing>
+          <wp:inline xmlns:a="http://schemas.openxmlformats.org/drawingml/2006/main" xmlns:pic="http://schemas.openxmlformats.org/drawingml/2006/picture">
+            <wp:extent cx="5029200" cy="5029200"/>
+            <wp:docPr id="1" name="Picture 1"/>
+            <wp:cNvGraphicFramePr>
+              <a:graphicFrameLocks noChangeAspect="1"/>
+            </wp:cNvGraphicFramePr>
+            <a:graphic>
+              <a:graphicData uri="http://schemas.openxmlformats.org/drawingml/2006/picture">
+                <pic:pic>
+                  <pic:nvPicPr>
+                    <pic:cNvPr id="0" name="1.png"/>
+                    <pic:cNvPicPr/>
+                  </pic:nvPicPr>
+                  <pic:blipFill>
+                    <a:blip r:embed="rId9"/>
+                    <a:stretch>
+                      <a:fillRect/>
+                    </a:stretch>
+                  </pic:blipFill>
+                  <pic:spPr>
+                    <a:xfrm>
+                      <a:off x="0" y="0"/>
+                      <a:ext cx="5029200" cy="5029200"/>
+                    </a:xfrm>
+                    <a:prstGeom prst="rect"/>
+                  </pic:spPr>
+                </pic:pic>
+              </a:graphicData>
+            </a:graphic>
+          </wp:inline>
+        </w:drawing>
+      </w:r>
+    </w:p>
+    <w:p>
+      <w:r>
+        <w:rPr>
+          <w:i/>
+          <w:sz w:val="18"/>
+        </w:rPr>
+        <w:t>Símbolo isolado, colorido, fundo creme</w:t>
+      </w:r>
+    </w:p>
+    <w:p>
+      <w:pPr>
+        <w:pStyle w:val="Heading2"/>
+      </w:pPr>
+      <w:r>
+        <w:t>Logo completo (símbolo + nome)</w:t>
+      </w:r>
+    </w:p>
+    <w:p>
+      <w:r>
+        <w:drawing>
+          <wp:inline xmlns:a="http://schemas.openxmlformats.org/drawingml/2006/main" xmlns:pic="http://schemas.openxmlformats.org/drawingml/2006/picture">
+            <wp:extent cx="5029200" cy="5029200"/>
+            <wp:docPr id="2" name="Picture 2"/>
+            <wp:cNvGraphicFramePr>
+              <a:graphicFrameLocks noChangeAspect="1"/>
+            </wp:cNvGraphicFramePr>
+            <a:graphic>
+              <a:graphicData uri="http://schemas.openxmlformats.org/drawingml/2006/picture">
+                <pic:pic>
+                  <pic:nvPicPr>
+                    <pic:cNvPr id="0" name="10.png"/>
+                    <pic:cNvPicPr/>
+                  </pic:nvPicPr>
+                  <pic:blipFill>
+                    <a:blip r:embed="rId10"/>
+                    <a:stretch>
+                      <a:fillRect/>
+                    </a:stretch>
+                  </pic:blipFill>
+                  <pic:spPr>
+                    <a:xfrm>
+                      <a:off x="0" y="0"/>
+                      <a:ext cx="5029200" cy="5029200"/>
+                    </a:xfrm>
+                    <a:prstGeom prst="rect"/>
+                  </pic:spPr>
+                </pic:pic>
+              </a:graphicData>
+            </a:graphic>
+          </wp:inline>
+        </w:drawing>
+      </w:r>
+    </w:p>
+    <w:p>
+      <w:r>
+        <w:rPr>
+          <w:i/>
+          <w:sz w:val="18"/>
+        </w:rPr>
+        <w:t>Logo completo vertical, colorido, fundo branco</w:t>
+      </w:r>
+    </w:p>
+    <w:p>
+      <w:pPr>
+        <w:pStyle w:val="Heading2"/>
+      </w:pPr>
+      <w:r>
+        <w:t>Logo horizontal</w:t>
+      </w:r>
+    </w:p>
+    <w:p>
+      <w:r>
+        <w:drawing>
+          <wp:inline xmlns:a="http://schemas.openxmlformats.org/drawingml/2006/main" xmlns:pic="http://schemas.openxmlformats.org/drawingml/2006/picture">
+            <wp:extent cx="5029200" cy="5029200"/>
+            <wp:docPr id="3" name="Picture 3"/>
+            <wp:cNvGraphicFramePr>
+              <a:graphicFrameLocks noChangeAspect="1"/>
+            </wp:cNvGraphicFramePr>
+            <a:graphic>
+              <a:graphicData uri="http://schemas.openxmlformats.org/drawingml/2006/picture">
+                <pic:pic>
+                  <pic:nvPicPr>
+                    <pic:cNvPr id="0" name="20.png"/>
+                    <pic:cNvPicPr/>
+                  </pic:nvPicPr>
+                  <pic:blipFill>
+                    <a:blip r:embed="rId11"/>
+                    <a:stretch>
+                      <a:fillRect/>
+                    </a:stretch>
+                  </pic:blipFill>
+                  <pic:spPr>
+                    <a:xfrm>
+                      <a:off x="0" y="0"/>
+                      <a:ext cx="5029200" cy="5029200"/>
+                    </a:xfrm>
+                    <a:prstGeom prst="rect"/>
+                  </pic:spPr>
+                </pic:pic>
+              </a:graphicData>
+            </a:graphic>
+          </wp:inline>
+        </w:drawing>
+      </w:r>
+    </w:p>
+    <w:p>
+      <w:r>
+        <w:rPr>
+          <w:i/>
+          <w:sz w:val="18"/>
+        </w:rPr>
+        <w:t>Logo horizontal, branco sobre fundo lilás</w:t>
+      </w:r>
+    </w:p>
+    <w:p>
+      <w:pPr>
+        <w:pStyle w:val="Heading2"/>
+      </w:pPr>
+      <w:r>
+        <w:t>Versão monocromática</w:t>
+      </w:r>
+    </w:p>
+    <w:p>
+      <w:r>
+        <w:drawing>
+          <wp:inline xmlns:a="http://schemas.openxmlformats.org/drawingml/2006/main" xmlns:pic="http://schemas.openxmlformats.org/drawingml/2006/picture">
+            <wp:extent cx="5029200" cy="5029200"/>
+            <wp:docPr id="4" name="Picture 4"/>
+            <wp:cNvGraphicFramePr>
+              <a:graphicFrameLocks noChangeAspect="1"/>
+            </wp:cNvGraphicFramePr>
+            <a:graphic>
+              <a:graphicData uri="http://schemas.openxmlformats.org/drawingml/2006/picture">
+                <pic:pic>
+                  <pic:nvPicPr>
+                    <pic:cNvPr id="0" name="6.png"/>
+                    <pic:cNvPicPr/>
+                  </pic:nvPicPr>
+                  <pic:blipFill>
+                    <a:blip r:embed="rId12"/>
+                    <a:stretch>
+                      <a:fillRect/>
+                    </a:stretch>
+                  </pic:blipFill>
+                  <pic:spPr>
+                    <a:xfrm>
+                      <a:off x="0" y="0"/>
+                      <a:ext cx="5029200" cy="5029200"/>
+                    </a:xfrm>
+                    <a:prstGeom prst="rect"/>
+                  </pic:spPr>
+                </pic:pic>
+              </a:graphicData>
+            </a:graphic>
+          </wp:inline>
+        </w:drawing>
+      </w:r>
+    </w:p>
+    <w:p>
+      <w:r>
+        <w:rPr>
+          <w:i/>
+          <w:sz w:val="18"/>
+        </w:rPr>
+        <w:t>Logo completo, versão monocromática marrom</w:t>
+      </w:r>
+    </w:p>
+    <w:p>
+      <w:pPr>
+        <w:pStyle w:val="Heading2"/>
+      </w:pPr>
+      <w:r>
+        <w:t>Aplicação — Post de Instagram (feed)</w:t>
+      </w:r>
+    </w:p>
+    <w:p>
+      <w:r>
+        <w:drawing>
+          <wp:inline xmlns:a="http://schemas.openxmlformats.org/drawingml/2006/main" xmlns:pic="http://schemas.openxmlformats.org/drawingml/2006/picture">
+            <wp:extent cx="5029200" cy="6286500"/>
+            <wp:docPr id="5" name="Picture 5"/>
+            <wp:cNvGraphicFramePr>
+              <a:graphicFrameLocks noChangeAspect="1"/>
+            </wp:cNvGraphicFramePr>
+            <a:graphic>
+              <a:graphicData uri="http://schemas.openxmlformats.org/drawingml/2006/picture">
+                <pic:pic>
+                  <pic:nvPicPr>
+                    <pic:cNvPr id="0" name="post-instagram-feed_exemplo.png"/>
+                    <pic:cNvPicPr/>
+                  </pic:nvPicPr>
+                  <pic:blipFill>
+                    <a:blip r:embed="rId13"/>
+                    <a:stretch>
+                      <a:fillRect/>
+                    </a:stretch>
+                  </pic:blipFill>
+                  <pic:spPr>
+                    <a:xfrm>
+                      <a:off x="0" y="0"/>
+                      <a:ext cx="5029200" cy="6286500"/>
+                    </a:xfrm>
+                    <a:prstGeom prst="rect"/>
+                  </pic:spPr>
+                </pic:pic>
+              </a:graphicData>
+            </a:graphic>
+          </wp:inline>
+        </w:drawing>
+      </w:r>
+    </w:p>
+    <w:p>
+      <w:r>
+        <w:rPr>
+          <w:i/>
+          <w:sz w:val="18"/>
+        </w:rPr>
+        <w:t>Aplicação fictícia em post de Instagram</w:t>
+      </w:r>
+    </w:p>
+    <w:p>
+      <w:pPr>
+        <w:pStyle w:val="Heading2"/>
+      </w:pPr>
+      <w:r>
+        <w:t>Aplicação — Anúncio (Stories/Reels)</w:t>
+      </w:r>
+    </w:p>
+    <w:p>
+      <w:r>
+        <w:drawing>
+          <wp:inline xmlns:a="http://schemas.openxmlformats.org/drawingml/2006/main" xmlns:pic="http://schemas.openxmlformats.org/drawingml/2006/picture">
+            <wp:extent cx="5029200" cy="8940800"/>
+            <wp:docPr id="6" name="Picture 6"/>
+            <wp:cNvGraphicFramePr>
+              <a:graphicFrameLocks noChangeAspect="1"/>
+            </wp:cNvGraphicFramePr>
+            <a:graphic>
+              <a:graphicData uri="http://schemas.openxmlformats.org/drawingml/2006/picture">
+                <pic:pic>
+                  <pic:nvPicPr>
+                    <pic:cNvPr id="0" name="anuncio-stories-reels_exemplo.png"/>
+                    <pic:cNvPicPr/>
+                  </pic:nvPicPr>
+                  <pic:blipFill>
+                    <a:blip r:embed="rId14"/>
+                    <a:stretch>
+                      <a:fillRect/>
+                    </a:stretch>
+                  </pic:blipFill>
+                  <pic:spPr>
+                    <a:xfrm>
+                      <a:off x="0" y="0"/>
+                      <a:ext cx="5029200" cy="8940800"/>
+                    </a:xfrm>
+                    <a:prstGeom prst="rect"/>
+                  </pic:spPr>
+                </pic:pic>
+              </a:graphicData>
+            </a:graphic>
+          </wp:inline>
+        </w:drawing>
+      </w:r>
+    </w:p>
+    <w:p>
+      <w:r>
+        <w:rPr>
+          <w:i/>
+          <w:sz w:val="18"/>
+        </w:rPr>
+        <w:t>Aplicação fictícia em anúncio de tráfego pago</w:t>
+      </w:r>
+    </w:p>
+    <w:p>
+      <w:pPr>
+        <w:pStyle w:val="Heading2"/>
+      </w:pPr>
+      <w:r>
+        <w:t>Aplicação — Banner de Imersão na Cachoeira</w:t>
+      </w:r>
+    </w:p>
+    <w:p>
+      <w:r>
+        <w:drawing>
+          <wp:inline xmlns:a="http://schemas.openxmlformats.org/drawingml/2006/main" xmlns:pic="http://schemas.openxmlformats.org/drawingml/2006/picture">
+            <wp:extent cx="5029200" cy="2828925"/>
+            <wp:docPr id="7" name="Picture 7"/>
+            <wp:cNvGraphicFramePr>
+              <a:graphicFrameLocks noChangeAspect="1"/>
+            </wp:cNvGraphicFramePr>
+            <a:graphic>
+              <a:graphicData uri="http://schemas.openxmlformats.org/drawingml/2006/picture">
+                <pic:pic>
+                  <pic:nvPicPr>
+                    <pic:cNvPr id="0" name="banner-imersao-cachoeira_exemplo.png"/>
+                    <pic:cNvPicPr/>
+                  </pic:nvPicPr>
+                  <pic:blipFill>
+                    <a:blip r:embed="rId15"/>
+                    <a:stretch>
+                      <a:fillRect/>
+                    </a:stretch>
+                  </pic:blipFill>
+                  <pic:spPr>
+                    <a:xfrm>
+                      <a:off x="0" y="0"/>
+                      <a:ext cx="5029200" cy="2828925"/>
+                    </a:xfrm>
+                    <a:prstGeom prst="rect"/>
+                  </pic:spPr>
+                </pic:pic>
+              </a:graphicData>
+            </a:graphic>
+          </wp:inline>
+        </w:drawing>
+      </w:r>
+    </w:p>
+    <w:p>
+      <w:r>
+        <w:rPr>
+          <w:i/>
+          <w:sz w:val="18"/>
+        </w:rPr>
+        <w:t>Aplicação fictícia em banner de evento</w:t>
+      </w:r>
+    </w:p>
     <w:sectPr>
       <w:pgSz w:w="12240" w:h="15840"/>
       <w:pgMar w:top="1440" w:right="1800" w:bottom="1440" w:left="1800" w:header="720" w:footer="720" w:gutter="0"/>

</xml_diff>